<commit_message>
Update Shafiqur project report part
</commit_message>
<xml_diff>
--- a/Shafiqur Part.docx
+++ b/Shafiqur Part.docx
@@ -30,15 +30,11 @@
               <w:ind w:left="0"/>
               <w:rPr>
                 <w:rFonts w:ascii="Times" w:hAnsi="Times" w:cs="Times"/>
-                <w:sz w:val="24"/>
-                <w:szCs w:val="24"/>
               </w:rPr>
             </w:pPr>
             <w:r>
               <w:rPr>
                 <w:rFonts w:ascii="Times" w:hAnsi="Times" w:cs="Times"/>
-                <w:sz w:val="24"/>
-                <w:szCs w:val="24"/>
               </w:rPr>
               <w:t>As A/An</w:t>
             </w:r>
@@ -54,15 +50,11 @@
               <w:ind w:left="0"/>
               <w:rPr>
                 <w:rFonts w:ascii="Times" w:hAnsi="Times" w:cs="Times"/>
-                <w:sz w:val="24"/>
-                <w:szCs w:val="24"/>
               </w:rPr>
             </w:pPr>
             <w:r>
               <w:rPr>
                 <w:rFonts w:ascii="Times" w:hAnsi="Times" w:cs="Times"/>
-                <w:sz w:val="24"/>
-                <w:szCs w:val="24"/>
               </w:rPr>
               <w:t>I want to</w:t>
             </w:r>
@@ -78,15 +70,11 @@
               <w:ind w:left="0"/>
               <w:rPr>
                 <w:rFonts w:ascii="Times" w:hAnsi="Times" w:cs="Times"/>
-                <w:sz w:val="24"/>
-                <w:szCs w:val="24"/>
               </w:rPr>
             </w:pPr>
             <w:r>
               <w:rPr>
                 <w:rFonts w:ascii="Times" w:hAnsi="Times" w:cs="Times"/>
-                <w:sz w:val="24"/>
-                <w:szCs w:val="24"/>
               </w:rPr>
               <w:t>So that</w:t>
             </w:r>
@@ -102,15 +90,11 @@
               <w:ind w:left="0"/>
               <w:rPr>
                 <w:rFonts w:ascii="Times" w:hAnsi="Times" w:cs="Times"/>
-                <w:sz w:val="24"/>
-                <w:szCs w:val="24"/>
               </w:rPr>
             </w:pPr>
             <w:r>
               <w:rPr>
                 <w:rFonts w:ascii="Times" w:hAnsi="Times" w:cs="Times"/>
-                <w:sz w:val="24"/>
-                <w:szCs w:val="24"/>
               </w:rPr>
               <w:t>Acceptance Criteria</w:t>
             </w:r>
@@ -133,15 +117,11 @@
               <w:ind w:left="0"/>
               <w:rPr>
                 <w:rFonts w:ascii="Times" w:hAnsi="Times" w:cs="Times"/>
-                <w:sz w:val="24"/>
-                <w:szCs w:val="24"/>
               </w:rPr>
             </w:pPr>
             <w:r>
               <w:rPr>
                 <w:rFonts w:ascii="Times" w:hAnsi="Times" w:cs="Times"/>
-                <w:sz w:val="24"/>
-                <w:szCs w:val="24"/>
               </w:rPr>
               <w:t>Pilots &amp; Co-Pilots</w:t>
             </w:r>
@@ -157,15 +137,11 @@
               <w:ind w:left="0"/>
               <w:rPr>
                 <w:rFonts w:ascii="Times" w:hAnsi="Times" w:cs="Times"/>
-                <w:sz w:val="24"/>
-                <w:szCs w:val="24"/>
               </w:rPr>
             </w:pPr>
             <w:r>
               <w:rPr>
                 <w:rFonts w:ascii="Times" w:hAnsi="Times" w:cs="Times"/>
-                <w:sz w:val="24"/>
-                <w:szCs w:val="24"/>
               </w:rPr>
               <w:t>Login to the system</w:t>
             </w:r>
@@ -179,16 +155,8 @@
             <w:pPr>
               <w:pStyle w:val="ListParagraph"/>
               <w:ind w:left="0"/>
-              <w:rPr>
-                <w:sz w:val="24"/>
-                <w:szCs w:val="24"/>
-              </w:rPr>
-            </w:pPr>
-            <w:r>
-              <w:rPr>
-                <w:sz w:val="24"/>
-                <w:szCs w:val="24"/>
-              </w:rPr>
+            </w:pPr>
+            <w:r>
               <w:t>The system can authenticate me</w:t>
             </w:r>
           </w:p>
@@ -203,15 +171,11 @@
               <w:ind w:left="0"/>
               <w:rPr>
                 <w:rFonts w:ascii="Times" w:hAnsi="Times" w:cs="Times"/>
-                <w:sz w:val="24"/>
-                <w:szCs w:val="24"/>
               </w:rPr>
             </w:pPr>
             <w:r>
               <w:rPr>
                 <w:rFonts w:ascii="Times" w:hAnsi="Times" w:cs="Times"/>
-                <w:sz w:val="24"/>
-                <w:szCs w:val="24"/>
               </w:rPr>
               <w:t>Successful login shows assigned flights</w:t>
             </w:r>
@@ -234,8 +198,6 @@
               <w:ind w:left="0"/>
               <w:rPr>
                 <w:rFonts w:ascii="Times" w:hAnsi="Times" w:cs="Times"/>
-                <w:sz w:val="24"/>
-                <w:szCs w:val="24"/>
               </w:rPr>
             </w:pPr>
           </w:p>
@@ -268,15 +230,11 @@
               <w:ind w:left="0"/>
               <w:rPr>
                 <w:rFonts w:ascii="Times" w:hAnsi="Times" w:cs="Times"/>
-                <w:sz w:val="24"/>
-                <w:szCs w:val="24"/>
               </w:rPr>
             </w:pPr>
             <w:r>
               <w:rPr>
                 <w:rFonts w:ascii="Times" w:hAnsi="Times" w:cs="Times"/>
-                <w:sz w:val="24"/>
-                <w:szCs w:val="24"/>
               </w:rPr>
               <w:t>flights</w:t>
             </w:r>
@@ -310,15 +268,11 @@
               <w:ind w:left="0"/>
               <w:rPr>
                 <w:rFonts w:ascii="Times" w:hAnsi="Times" w:cs="Times"/>
-                <w:sz w:val="24"/>
-                <w:szCs w:val="24"/>
               </w:rPr>
             </w:pPr>
             <w:r>
               <w:rPr>
                 <w:rFonts w:ascii="Times" w:hAnsi="Times" w:cs="Times"/>
-                <w:sz w:val="24"/>
-                <w:szCs w:val="24"/>
               </w:rPr>
               <w:t>upcoming flights</w:t>
             </w:r>
@@ -363,8 +317,6 @@
               <w:ind w:left="0"/>
               <w:rPr>
                 <w:rFonts w:ascii="Times" w:hAnsi="Times" w:cs="Times"/>
-                <w:sz w:val="24"/>
-                <w:szCs w:val="24"/>
               </w:rPr>
             </w:pPr>
           </w:p>
@@ -379,15 +331,11 @@
               <w:ind w:left="0"/>
               <w:rPr>
                 <w:rFonts w:ascii="Times" w:hAnsi="Times" w:cs="Times"/>
-                <w:sz w:val="24"/>
-                <w:szCs w:val="24"/>
               </w:rPr>
             </w:pPr>
             <w:r>
               <w:rPr>
                 <w:rFonts w:ascii="Times" w:hAnsi="Times" w:cs="Times"/>
-                <w:sz w:val="24"/>
-                <w:szCs w:val="24"/>
               </w:rPr>
               <w:t>Update flight status</w:t>
             </w:r>
@@ -425,15 +373,11 @@
               <w:ind w:left="0"/>
               <w:rPr>
                 <w:rFonts w:ascii="Times" w:hAnsi="Times" w:cs="Times"/>
-                <w:sz w:val="24"/>
-                <w:szCs w:val="24"/>
               </w:rPr>
             </w:pPr>
             <w:r>
               <w:rPr>
                 <w:rFonts w:ascii="Times" w:hAnsi="Times" w:cs="Times"/>
-                <w:sz w:val="24"/>
-                <w:szCs w:val="24"/>
               </w:rPr>
               <w:t>Flight status change updates notifications</w:t>
             </w:r>
@@ -456,8 +400,6 @@
               <w:ind w:left="0"/>
               <w:rPr>
                 <w:rFonts w:ascii="Times" w:hAnsi="Times" w:cs="Times"/>
-                <w:sz w:val="24"/>
-                <w:szCs w:val="24"/>
               </w:rPr>
             </w:pPr>
           </w:p>
@@ -472,15 +414,11 @@
               <w:ind w:left="0"/>
               <w:rPr>
                 <w:rFonts w:ascii="Times" w:hAnsi="Times" w:cs="Times"/>
-                <w:sz w:val="24"/>
-                <w:szCs w:val="24"/>
               </w:rPr>
             </w:pPr>
             <w:r>
               <w:rPr>
                 <w:rFonts w:ascii="Times" w:hAnsi="Times" w:cs="Times"/>
-                <w:sz w:val="24"/>
-                <w:szCs w:val="24"/>
               </w:rPr>
               <w:t>Complete digital safety checklist</w:t>
             </w:r>
@@ -496,15 +434,11 @@
               <w:ind w:left="0"/>
               <w:rPr>
                 <w:rFonts w:ascii="Times" w:hAnsi="Times" w:cs="Times"/>
-                <w:sz w:val="24"/>
-                <w:szCs w:val="24"/>
               </w:rPr>
             </w:pPr>
             <w:r>
               <w:rPr>
                 <w:rFonts w:ascii="Times" w:hAnsi="Times" w:cs="Times"/>
-                <w:sz w:val="24"/>
-                <w:szCs w:val="24"/>
               </w:rPr>
               <w:t>Flights meet safety standards</w:t>
             </w:r>
@@ -538,15 +472,11 @@
               <w:ind w:left="0"/>
               <w:rPr>
                 <w:rFonts w:ascii="Times" w:hAnsi="Times" w:cs="Times"/>
-                <w:sz w:val="24"/>
-                <w:szCs w:val="24"/>
               </w:rPr>
             </w:pPr>
             <w:r>
               <w:rPr>
                 <w:rFonts w:ascii="Times" w:hAnsi="Times" w:cs="Times"/>
-                <w:sz w:val="24"/>
-                <w:szCs w:val="24"/>
               </w:rPr>
               <w:t>completion</w:t>
             </w:r>
@@ -570,8 +500,6 @@
               <w:ind w:left="0"/>
               <w:rPr>
                 <w:rFonts w:ascii="Times" w:hAnsi="Times" w:cs="Times"/>
-                <w:sz w:val="24"/>
-                <w:szCs w:val="24"/>
               </w:rPr>
             </w:pPr>
           </w:p>
@@ -586,15 +514,11 @@
               <w:ind w:left="0"/>
               <w:rPr>
                 <w:rFonts w:ascii="Times" w:hAnsi="Times" w:cs="Times"/>
-                <w:sz w:val="24"/>
-                <w:szCs w:val="24"/>
               </w:rPr>
             </w:pPr>
             <w:r>
               <w:rPr>
                 <w:rFonts w:ascii="Times" w:hAnsi="Times" w:cs="Times"/>
-                <w:sz w:val="24"/>
-                <w:szCs w:val="24"/>
               </w:rPr>
               <w:t>Submit post-flight log</w:t>
             </w:r>
@@ -610,15 +534,11 @@
               <w:ind w:left="0"/>
               <w:rPr>
                 <w:rFonts w:ascii="Times" w:hAnsi="Times" w:cs="Times"/>
-                <w:sz w:val="24"/>
-                <w:szCs w:val="24"/>
               </w:rPr>
             </w:pPr>
             <w:r>
               <w:rPr>
                 <w:rFonts w:ascii="Times" w:hAnsi="Times" w:cs="Times"/>
-                <w:sz w:val="24"/>
-                <w:szCs w:val="24"/>
               </w:rPr>
               <w:t>Records stay updated</w:t>
             </w:r>
@@ -634,15 +554,11 @@
               <w:ind w:left="0"/>
               <w:rPr>
                 <w:rFonts w:ascii="Times" w:hAnsi="Times" w:cs="Times"/>
-                <w:sz w:val="24"/>
-                <w:szCs w:val="24"/>
               </w:rPr>
             </w:pPr>
             <w:r>
               <w:rPr>
                 <w:rFonts w:ascii="Times" w:hAnsi="Times" w:cs="Times"/>
-                <w:sz w:val="24"/>
-                <w:szCs w:val="24"/>
               </w:rPr>
               <w:t>System confirms log saved successfully</w:t>
             </w:r>
@@ -1020,7 +936,6 @@
                 <w:sz w:val="24"/>
                 <w:szCs w:val="24"/>
               </w:rPr>
-              <w:lastRenderedPageBreak/>
               <w:t xml:space="preserve">   System Admin</w:t>
             </w:r>
           </w:p>
@@ -1043,7 +958,6 @@
                 <w:sz w:val="24"/>
                 <w:szCs w:val="24"/>
               </w:rPr>
-              <w:lastRenderedPageBreak/>
               <w:t>Login securely</w:t>
             </w:r>
           </w:p>
@@ -2684,9 +2598,6 @@
         </w:tc>
       </w:tr>
     </w:tbl>
-    <w:p/>
-    <w:p/>
-    <w:p/>
     <w:p/>
     <w:p/>
     <w:p>
@@ -2694,8 +2605,9 @@
         <w:rPr>
           <w:noProof/>
         </w:rPr>
+        <w:lastRenderedPageBreak/>
         <w:drawing>
-          <wp:anchor distT="0" distB="0" distL="114300" distR="114300" simplePos="0" relativeHeight="251663360" behindDoc="1" locked="0" layoutInCell="1" allowOverlap="1" wp14:anchorId="6E1ECC7B" wp14:editId="2E978B1D">
+          <wp:anchor distT="0" distB="0" distL="114300" distR="114300" simplePos="0" relativeHeight="251663360" behindDoc="1" locked="0" layoutInCell="1" allowOverlap="1" wp14:anchorId="6E1ECC7B" wp14:editId="119996B5">
             <wp:simplePos x="0" y="0"/>
             <wp:positionH relativeFrom="margin">
               <wp:posOffset>2277110</wp:posOffset>
@@ -3134,6 +3046,7 @@
       </w:r>
     </w:p>
     <w:p/>
+    <w:p/>
     <w:p>
       <w:r>
         <w:rPr>
@@ -3141,13 +3054,163 @@
         </w:rPr>
         <w:lastRenderedPageBreak/>
         <w:drawing>
-          <wp:anchor distT="0" distB="0" distL="114300" distR="114300" simplePos="0" relativeHeight="251668480" behindDoc="1" locked="0" layoutInCell="1" allowOverlap="1" wp14:anchorId="1ECF22CC" wp14:editId="0990A34A">
+          <wp:anchor distT="0" distB="0" distL="114300" distR="114300" simplePos="0" relativeHeight="251667456" behindDoc="1" locked="0" layoutInCell="1" allowOverlap="1" wp14:anchorId="65CB9600" wp14:editId="4D3A6E17">
             <wp:simplePos x="0" y="0"/>
             <wp:positionH relativeFrom="margin">
-              <wp:align>right</wp:align>
+              <wp:posOffset>2096814</wp:posOffset>
             </wp:positionH>
-            <wp:positionV relativeFrom="paragraph">
-              <wp:posOffset>13458</wp:posOffset>
+            <wp:positionV relativeFrom="page">
+              <wp:posOffset>914400</wp:posOffset>
+            </wp:positionV>
+            <wp:extent cx="1774190" cy="3411855"/>
+            <wp:effectExtent l="0" t="0" r="0" b="0"/>
+            <wp:wrapTight wrapText="bothSides">
+              <wp:wrapPolygon edited="0">
+                <wp:start x="0" y="0"/>
+                <wp:lineTo x="0" y="21467"/>
+                <wp:lineTo x="21337" y="21467"/>
+                <wp:lineTo x="21337" y="0"/>
+                <wp:lineTo x="0" y="0"/>
+              </wp:wrapPolygon>
+            </wp:wrapTight>
+            <wp:docPr id="1174013605" name="Picture 9"/>
+            <wp:cNvGraphicFramePr>
+              <a:graphicFrameLocks xmlns:a="http://schemas.openxmlformats.org/drawingml/2006/main" noChangeAspect="1"/>
+            </wp:cNvGraphicFramePr>
+            <a:graphic xmlns:a="http://schemas.openxmlformats.org/drawingml/2006/main">
+              <a:graphicData uri="http://schemas.openxmlformats.org/drawingml/2006/picture">
+                <pic:pic xmlns:pic="http://schemas.openxmlformats.org/drawingml/2006/picture">
+                  <pic:nvPicPr>
+                    <pic:cNvPr id="0" name="Picture 9"/>
+                    <pic:cNvPicPr>
+                      <a:picLocks noChangeAspect="1" noChangeArrowheads="1"/>
+                    </pic:cNvPicPr>
+                  </pic:nvPicPr>
+                  <pic:blipFill>
+                    <a:blip r:embed="rId10">
+                      <a:extLst>
+                        <a:ext uri="{28A0092B-C50C-407E-A947-70E740481C1C}">
+                          <a14:useLocalDpi xmlns:a14="http://schemas.microsoft.com/office/drawing/2010/main" val="0"/>
+                        </a:ext>
+                      </a:extLst>
+                    </a:blip>
+                    <a:srcRect/>
+                    <a:stretch>
+                      <a:fillRect/>
+                    </a:stretch>
+                  </pic:blipFill>
+                  <pic:spPr bwMode="auto">
+                    <a:xfrm>
+                      <a:off x="0" y="0"/>
+                      <a:ext cx="1774190" cy="3411855"/>
+                    </a:xfrm>
+                    <a:prstGeom prst="rect">
+                      <a:avLst/>
+                    </a:prstGeom>
+                    <a:noFill/>
+                    <a:ln>
+                      <a:noFill/>
+                    </a:ln>
+                  </pic:spPr>
+                </pic:pic>
+              </a:graphicData>
+            </a:graphic>
+            <wp14:sizeRelH relativeFrom="margin">
+              <wp14:pctWidth>0</wp14:pctWidth>
+            </wp14:sizeRelH>
+            <wp14:sizeRelV relativeFrom="margin">
+              <wp14:pctHeight>0</wp14:pctHeight>
+            </wp14:sizeRelV>
+          </wp:anchor>
+        </w:drawing>
+      </w:r>
+      <w:r>
+        <w:rPr>
+          <w:noProof/>
+        </w:rPr>
+        <w:drawing>
+          <wp:anchor distT="0" distB="0" distL="114300" distR="114300" simplePos="0" relativeHeight="251666432" behindDoc="1" locked="0" layoutInCell="1" allowOverlap="1" wp14:anchorId="7E900326" wp14:editId="2FBBC4E4">
+            <wp:simplePos x="0" y="0"/>
+            <wp:positionH relativeFrom="margin">
+              <wp:posOffset>0</wp:posOffset>
+            </wp:positionH>
+            <wp:positionV relativeFrom="page">
+              <wp:posOffset>914400</wp:posOffset>
+            </wp:positionV>
+            <wp:extent cx="1718945" cy="3329940"/>
+            <wp:effectExtent l="0" t="0" r="0" b="3810"/>
+            <wp:wrapTight wrapText="bothSides">
+              <wp:wrapPolygon edited="0">
+                <wp:start x="0" y="0"/>
+                <wp:lineTo x="0" y="21501"/>
+                <wp:lineTo x="21305" y="21501"/>
+                <wp:lineTo x="21305" y="0"/>
+                <wp:lineTo x="0" y="0"/>
+              </wp:wrapPolygon>
+            </wp:wrapTight>
+            <wp:docPr id="1040071867" name="Picture 8"/>
+            <wp:cNvGraphicFramePr>
+              <a:graphicFrameLocks xmlns:a="http://schemas.openxmlformats.org/drawingml/2006/main" noChangeAspect="1"/>
+            </wp:cNvGraphicFramePr>
+            <a:graphic xmlns:a="http://schemas.openxmlformats.org/drawingml/2006/main">
+              <a:graphicData uri="http://schemas.openxmlformats.org/drawingml/2006/picture">
+                <pic:pic xmlns:pic="http://schemas.openxmlformats.org/drawingml/2006/picture">
+                  <pic:nvPicPr>
+                    <pic:cNvPr id="0" name="Picture 8"/>
+                    <pic:cNvPicPr>
+                      <a:picLocks noChangeAspect="1" noChangeArrowheads="1"/>
+                    </pic:cNvPicPr>
+                  </pic:nvPicPr>
+                  <pic:blipFill>
+                    <a:blip r:embed="rId11">
+                      <a:extLst>
+                        <a:ext uri="{28A0092B-C50C-407E-A947-70E740481C1C}">
+                          <a14:useLocalDpi xmlns:a14="http://schemas.microsoft.com/office/drawing/2010/main" val="0"/>
+                        </a:ext>
+                      </a:extLst>
+                    </a:blip>
+                    <a:srcRect/>
+                    <a:stretch>
+                      <a:fillRect/>
+                    </a:stretch>
+                  </pic:blipFill>
+                  <pic:spPr bwMode="auto">
+                    <a:xfrm>
+                      <a:off x="0" y="0"/>
+                      <a:ext cx="1718945" cy="3329940"/>
+                    </a:xfrm>
+                    <a:prstGeom prst="rect">
+                      <a:avLst/>
+                    </a:prstGeom>
+                    <a:noFill/>
+                    <a:ln>
+                      <a:noFill/>
+                    </a:ln>
+                  </pic:spPr>
+                </pic:pic>
+              </a:graphicData>
+            </a:graphic>
+            <wp14:sizeRelH relativeFrom="margin">
+              <wp14:pctWidth>0</wp14:pctWidth>
+            </wp14:sizeRelH>
+            <wp14:sizeRelV relativeFrom="margin">
+              <wp14:pctHeight>0</wp14:pctHeight>
+            </wp14:sizeRelV>
+          </wp:anchor>
+        </w:drawing>
+      </w:r>
+      <w:r>
+        <w:rPr>
+          <w:noProof/>
+        </w:rPr>
+        <w:drawing>
+          <wp:anchor distT="0" distB="0" distL="114300" distR="114300" simplePos="0" relativeHeight="251668480" behindDoc="1" locked="0" layoutInCell="1" allowOverlap="1" wp14:anchorId="1ECF22CC" wp14:editId="379BDD89">
+            <wp:simplePos x="0" y="0"/>
+            <wp:positionH relativeFrom="margin">
+              <wp:posOffset>4193628</wp:posOffset>
+            </wp:positionH>
+            <wp:positionV relativeFrom="page">
+              <wp:posOffset>914400</wp:posOffset>
             </wp:positionV>
             <wp:extent cx="1746250" cy="3411855"/>
             <wp:effectExtent l="0" t="0" r="6350" b="0"/>
@@ -3174,156 +3237,6 @@
                     </pic:cNvPicPr>
                   </pic:nvPicPr>
                   <pic:blipFill>
-                    <a:blip r:embed="rId10">
-                      <a:extLst>
-                        <a:ext uri="{28A0092B-C50C-407E-A947-70E740481C1C}">
-                          <a14:useLocalDpi xmlns:a14="http://schemas.microsoft.com/office/drawing/2010/main" val="0"/>
-                        </a:ext>
-                      </a:extLst>
-                    </a:blip>
-                    <a:srcRect/>
-                    <a:stretch>
-                      <a:fillRect/>
-                    </a:stretch>
-                  </pic:blipFill>
-                  <pic:spPr bwMode="auto">
-                    <a:xfrm>
-                      <a:off x="0" y="0"/>
-                      <a:ext cx="1746279" cy="3411911"/>
-                    </a:xfrm>
-                    <a:prstGeom prst="rect">
-                      <a:avLst/>
-                    </a:prstGeom>
-                    <a:noFill/>
-                    <a:ln>
-                      <a:noFill/>
-                    </a:ln>
-                  </pic:spPr>
-                </pic:pic>
-              </a:graphicData>
-            </a:graphic>
-            <wp14:sizeRelH relativeFrom="margin">
-              <wp14:pctWidth>0</wp14:pctWidth>
-            </wp14:sizeRelH>
-            <wp14:sizeRelV relativeFrom="margin">
-              <wp14:pctHeight>0</wp14:pctHeight>
-            </wp14:sizeRelV>
-          </wp:anchor>
-        </w:drawing>
-      </w:r>
-      <w:r>
-        <w:rPr>
-          <w:noProof/>
-        </w:rPr>
-        <w:drawing>
-          <wp:anchor distT="0" distB="0" distL="114300" distR="114300" simplePos="0" relativeHeight="251667456" behindDoc="1" locked="0" layoutInCell="1" allowOverlap="1" wp14:anchorId="65CB9600" wp14:editId="58D42DEC">
-            <wp:simplePos x="0" y="0"/>
-            <wp:positionH relativeFrom="margin">
-              <wp:align>center</wp:align>
-            </wp:positionH>
-            <wp:positionV relativeFrom="paragraph">
-              <wp:posOffset>14084</wp:posOffset>
-            </wp:positionV>
-            <wp:extent cx="1774190" cy="3411855"/>
-            <wp:effectExtent l="0" t="0" r="0" b="0"/>
-            <wp:wrapTight wrapText="bothSides">
-              <wp:wrapPolygon edited="0">
-                <wp:start x="0" y="0"/>
-                <wp:lineTo x="0" y="21467"/>
-                <wp:lineTo x="21337" y="21467"/>
-                <wp:lineTo x="21337" y="0"/>
-                <wp:lineTo x="0" y="0"/>
-              </wp:wrapPolygon>
-            </wp:wrapTight>
-            <wp:docPr id="1174013605" name="Picture 9"/>
-            <wp:cNvGraphicFramePr>
-              <a:graphicFrameLocks xmlns:a="http://schemas.openxmlformats.org/drawingml/2006/main" noChangeAspect="1"/>
-            </wp:cNvGraphicFramePr>
-            <a:graphic xmlns:a="http://schemas.openxmlformats.org/drawingml/2006/main">
-              <a:graphicData uri="http://schemas.openxmlformats.org/drawingml/2006/picture">
-                <pic:pic xmlns:pic="http://schemas.openxmlformats.org/drawingml/2006/picture">
-                  <pic:nvPicPr>
-                    <pic:cNvPr id="0" name="Picture 9"/>
-                    <pic:cNvPicPr>
-                      <a:picLocks noChangeAspect="1" noChangeArrowheads="1"/>
-                    </pic:cNvPicPr>
-                  </pic:nvPicPr>
-                  <pic:blipFill>
-                    <a:blip r:embed="rId11">
-                      <a:extLst>
-                        <a:ext uri="{28A0092B-C50C-407E-A947-70E740481C1C}">
-                          <a14:useLocalDpi xmlns:a14="http://schemas.microsoft.com/office/drawing/2010/main" val="0"/>
-                        </a:ext>
-                      </a:extLst>
-                    </a:blip>
-                    <a:srcRect/>
-                    <a:stretch>
-                      <a:fillRect/>
-                    </a:stretch>
-                  </pic:blipFill>
-                  <pic:spPr bwMode="auto">
-                    <a:xfrm>
-                      <a:off x="0" y="0"/>
-                      <a:ext cx="1774665" cy="3412854"/>
-                    </a:xfrm>
-                    <a:prstGeom prst="rect">
-                      <a:avLst/>
-                    </a:prstGeom>
-                    <a:noFill/>
-                    <a:ln>
-                      <a:noFill/>
-                    </a:ln>
-                  </pic:spPr>
-                </pic:pic>
-              </a:graphicData>
-            </a:graphic>
-            <wp14:sizeRelH relativeFrom="margin">
-              <wp14:pctWidth>0</wp14:pctWidth>
-            </wp14:sizeRelH>
-            <wp14:sizeRelV relativeFrom="margin">
-              <wp14:pctHeight>0</wp14:pctHeight>
-            </wp14:sizeRelV>
-          </wp:anchor>
-        </w:drawing>
-      </w:r>
-      <w:r>
-        <w:rPr>
-          <w:noProof/>
-        </w:rPr>
-        <w:drawing>
-          <wp:anchor distT="0" distB="0" distL="114300" distR="114300" simplePos="0" relativeHeight="251666432" behindDoc="1" locked="0" layoutInCell="1" allowOverlap="1" wp14:anchorId="7E900326" wp14:editId="19A5DB68">
-            <wp:simplePos x="0" y="0"/>
-            <wp:positionH relativeFrom="margin">
-              <wp:align>left</wp:align>
-            </wp:positionH>
-            <wp:positionV relativeFrom="paragraph">
-              <wp:posOffset>436</wp:posOffset>
-            </wp:positionV>
-            <wp:extent cx="1718945" cy="3329940"/>
-            <wp:effectExtent l="0" t="0" r="0" b="3810"/>
-            <wp:wrapTight wrapText="bothSides">
-              <wp:wrapPolygon edited="0">
-                <wp:start x="0" y="0"/>
-                <wp:lineTo x="0" y="21501"/>
-                <wp:lineTo x="21305" y="21501"/>
-                <wp:lineTo x="21305" y="0"/>
-                <wp:lineTo x="0" y="0"/>
-              </wp:wrapPolygon>
-            </wp:wrapTight>
-            <wp:docPr id="1040071867" name="Picture 8"/>
-            <wp:cNvGraphicFramePr>
-              <a:graphicFrameLocks xmlns:a="http://schemas.openxmlformats.org/drawingml/2006/main" noChangeAspect="1"/>
-            </wp:cNvGraphicFramePr>
-            <a:graphic xmlns:a="http://schemas.openxmlformats.org/drawingml/2006/main">
-              <a:graphicData uri="http://schemas.openxmlformats.org/drawingml/2006/picture">
-                <pic:pic xmlns:pic="http://schemas.openxmlformats.org/drawingml/2006/picture">
-                  <pic:nvPicPr>
-                    <pic:cNvPr id="0" name="Picture 8"/>
-                    <pic:cNvPicPr>
-                      <a:picLocks noChangeAspect="1" noChangeArrowheads="1"/>
-                    </pic:cNvPicPr>
-                  </pic:nvPicPr>
-                  <pic:blipFill>
                     <a:blip r:embed="rId12">
                       <a:extLst>
                         <a:ext uri="{28A0092B-C50C-407E-A947-70E740481C1C}">
@@ -3339,7 +3252,7 @@
                   <pic:spPr bwMode="auto">
                     <a:xfrm>
                       <a:off x="0" y="0"/>
-                      <a:ext cx="1719677" cy="3331472"/>
+                      <a:ext cx="1746250" cy="3411855"/>
                     </a:xfrm>
                     <a:prstGeom prst="rect">
                       <a:avLst/>
@@ -3370,13 +3283,103 @@
           <w:noProof/>
         </w:rPr>
         <w:drawing>
-          <wp:anchor distT="0" distB="0" distL="114300" distR="114300" simplePos="0" relativeHeight="251670528" behindDoc="1" locked="0" layoutInCell="1" allowOverlap="1" wp14:anchorId="3E44687C" wp14:editId="11661B97">
+          <wp:anchor distT="0" distB="0" distL="114300" distR="114300" simplePos="0" relativeHeight="251671552" behindDoc="1" locked="1" layoutInCell="1" allowOverlap="0" wp14:anchorId="25E35F98" wp14:editId="1DF5546E">
             <wp:simplePos x="0" y="0"/>
             <wp:positionH relativeFrom="margin">
-              <wp:align>center</wp:align>
+              <wp:align>right</wp:align>
             </wp:positionH>
-            <wp:positionV relativeFrom="paragraph">
-              <wp:posOffset>137160</wp:posOffset>
+            <wp:positionV relativeFrom="margin">
+              <wp:align>bottom</wp:align>
+            </wp:positionV>
+            <wp:extent cx="1655064" cy="3658161"/>
+            <wp:effectExtent l="0" t="0" r="2540" b="0"/>
+            <wp:wrapTight wrapText="bothSides">
+              <wp:wrapPolygon edited="0">
+                <wp:start x="0" y="0"/>
+                <wp:lineTo x="0" y="21488"/>
+                <wp:lineTo x="21384" y="21488"/>
+                <wp:lineTo x="21384" y="0"/>
+                <wp:lineTo x="0" y="0"/>
+              </wp:wrapPolygon>
+            </wp:wrapTight>
+            <wp:docPr id="1689641196" name="Picture 15"/>
+            <wp:cNvGraphicFramePr>
+              <a:graphicFrameLocks xmlns:a="http://schemas.openxmlformats.org/drawingml/2006/main" noChangeAspect="1"/>
+            </wp:cNvGraphicFramePr>
+            <a:graphic xmlns:a="http://schemas.openxmlformats.org/drawingml/2006/main">
+              <a:graphicData uri="http://schemas.openxmlformats.org/drawingml/2006/picture">
+                <pic:pic xmlns:pic="http://schemas.openxmlformats.org/drawingml/2006/picture">
+                  <pic:nvPicPr>
+                    <pic:cNvPr id="0" name="Picture 15"/>
+                    <pic:cNvPicPr>
+                      <a:picLocks noChangeAspect="1" noChangeArrowheads="1"/>
+                    </pic:cNvPicPr>
+                  </pic:nvPicPr>
+                  <pic:blipFill>
+                    <a:blip r:embed="rId13">
+                      <a:extLst>
+                        <a:ext uri="{28A0092B-C50C-407E-A947-70E740481C1C}">
+                          <a14:useLocalDpi xmlns:a14="http://schemas.microsoft.com/office/drawing/2010/main" val="0"/>
+                        </a:ext>
+                      </a:extLst>
+                    </a:blip>
+                    <a:srcRect/>
+                    <a:stretch>
+                      <a:fillRect/>
+                    </a:stretch>
+                  </pic:blipFill>
+                  <pic:spPr bwMode="auto">
+                    <a:xfrm>
+                      <a:off x="0" y="0"/>
+                      <a:ext cx="1655064" cy="3658161"/>
+                    </a:xfrm>
+                    <a:prstGeom prst="rect">
+                      <a:avLst/>
+                    </a:prstGeom>
+                    <a:noFill/>
+                    <a:ln>
+                      <a:noFill/>
+                    </a:ln>
+                  </pic:spPr>
+                </pic:pic>
+              </a:graphicData>
+            </a:graphic>
+            <wp14:sizeRelH relativeFrom="margin">
+              <wp14:pctWidth>0</wp14:pctWidth>
+            </wp14:sizeRelH>
+            <wp14:sizeRelV relativeFrom="margin">
+              <wp14:pctHeight>0</wp14:pctHeight>
+            </wp14:sizeRelV>
+          </wp:anchor>
+        </w:drawing>
+      </w:r>
+    </w:p>
+    <w:p/>
+    <w:p>
+      <w:r>
+        <w:t>F</w:t>
+      </w:r>
+    </w:p>
+    <w:p/>
+    <w:p/>
+    <w:p/>
+    <w:p/>
+    <w:p/>
+    <w:p/>
+    <w:p/>
+    <w:p>
+      <w:r>
+        <w:rPr>
+          <w:noProof/>
+        </w:rPr>
+        <w:drawing>
+          <wp:anchor distT="0" distB="0" distL="114300" distR="114300" simplePos="0" relativeHeight="251670528" behindDoc="1" locked="0" layoutInCell="1" allowOverlap="1" wp14:anchorId="3E44687C" wp14:editId="1F013386">
+            <wp:simplePos x="0" y="0"/>
+            <wp:positionH relativeFrom="margin">
+              <wp:posOffset>2224585</wp:posOffset>
+            </wp:positionH>
+            <wp:positionV relativeFrom="page">
+              <wp:posOffset>5431809</wp:posOffset>
             </wp:positionV>
             <wp:extent cx="1752600" cy="3690620"/>
             <wp:effectExtent l="0" t="0" r="0" b="5080"/>
@@ -3403,7 +3406,7 @@
                     </pic:cNvPicPr>
                   </pic:nvPicPr>
                   <pic:blipFill>
-                    <a:blip r:embed="rId13">
+                    <a:blip r:embed="rId14">
                       <a:extLst>
                         <a:ext uri="{28A0092B-C50C-407E-A947-70E740481C1C}">
                           <a14:useLocalDpi xmlns:a14="http://schemas.microsoft.com/office/drawing/2010/main" val="0"/>
@@ -3440,97 +3443,20 @@
           </wp:anchor>
         </w:drawing>
       </w:r>
-      <w:r>
-        <w:rPr>
-          <w:noProof/>
-        </w:rPr>
-        <w:drawing>
-          <wp:anchor distT="0" distB="0" distL="114300" distR="114300" simplePos="0" relativeHeight="251671552" behindDoc="1" locked="0" layoutInCell="1" allowOverlap="1" wp14:anchorId="25E35F98" wp14:editId="3B6451B2">
-            <wp:simplePos x="0" y="0"/>
-            <wp:positionH relativeFrom="margin">
-              <wp:align>right</wp:align>
-            </wp:positionH>
-            <wp:positionV relativeFrom="paragraph">
-              <wp:posOffset>12065</wp:posOffset>
-            </wp:positionV>
-            <wp:extent cx="1657350" cy="3661410"/>
-            <wp:effectExtent l="0" t="0" r="0" b="0"/>
-            <wp:wrapTight wrapText="bothSides">
-              <wp:wrapPolygon edited="0">
-                <wp:start x="0" y="0"/>
-                <wp:lineTo x="0" y="21465"/>
-                <wp:lineTo x="21352" y="21465"/>
-                <wp:lineTo x="21352" y="0"/>
-                <wp:lineTo x="0" y="0"/>
-              </wp:wrapPolygon>
-            </wp:wrapTight>
-            <wp:docPr id="1689641196" name="Picture 15"/>
-            <wp:cNvGraphicFramePr>
-              <a:graphicFrameLocks xmlns:a="http://schemas.openxmlformats.org/drawingml/2006/main" noChangeAspect="1"/>
-            </wp:cNvGraphicFramePr>
-            <a:graphic xmlns:a="http://schemas.openxmlformats.org/drawingml/2006/main">
-              <a:graphicData uri="http://schemas.openxmlformats.org/drawingml/2006/picture">
-                <pic:pic xmlns:pic="http://schemas.openxmlformats.org/drawingml/2006/picture">
-                  <pic:nvPicPr>
-                    <pic:cNvPr id="0" name="Picture 15"/>
-                    <pic:cNvPicPr>
-                      <a:picLocks noChangeAspect="1" noChangeArrowheads="1"/>
-                    </pic:cNvPicPr>
-                  </pic:nvPicPr>
-                  <pic:blipFill>
-                    <a:blip r:embed="rId14">
-                      <a:extLst>
-                        <a:ext uri="{28A0092B-C50C-407E-A947-70E740481C1C}">
-                          <a14:useLocalDpi xmlns:a14="http://schemas.microsoft.com/office/drawing/2010/main" val="0"/>
-                        </a:ext>
-                      </a:extLst>
-                    </a:blip>
-                    <a:srcRect/>
-                    <a:stretch>
-                      <a:fillRect/>
-                    </a:stretch>
-                  </pic:blipFill>
-                  <pic:spPr bwMode="auto">
-                    <a:xfrm>
-                      <a:off x="0" y="0"/>
-                      <a:ext cx="1657350" cy="3661410"/>
-                    </a:xfrm>
-                    <a:prstGeom prst="rect">
-                      <a:avLst/>
-                    </a:prstGeom>
-                    <a:noFill/>
-                    <a:ln>
-                      <a:noFill/>
-                    </a:ln>
-                  </pic:spPr>
-                </pic:pic>
-              </a:graphicData>
-            </a:graphic>
-            <wp14:sizeRelH relativeFrom="margin">
-              <wp14:pctWidth>0</wp14:pctWidth>
-            </wp14:sizeRelH>
-            <wp14:sizeRelV relativeFrom="margin">
-              <wp14:pctHeight>0</wp14:pctHeight>
-            </wp14:sizeRelV>
-          </wp:anchor>
-        </w:drawing>
-      </w:r>
     </w:p>
-    <w:p/>
-    <w:p/>
     <w:p>
       <w:r>
         <w:rPr>
           <w:noProof/>
         </w:rPr>
         <w:drawing>
-          <wp:anchor distT="0" distB="0" distL="114300" distR="114300" simplePos="0" relativeHeight="251669504" behindDoc="1" locked="0" layoutInCell="1" allowOverlap="1" wp14:anchorId="1B2982A0" wp14:editId="7B181FF5">
+          <wp:anchor distT="0" distB="0" distL="114300" distR="114300" simplePos="0" relativeHeight="251669504" behindDoc="1" locked="0" layoutInCell="1" allowOverlap="1" wp14:anchorId="1B2982A0" wp14:editId="36E9BFE2">
             <wp:simplePos x="0" y="0"/>
             <wp:positionH relativeFrom="margin">
-              <wp:align>left</wp:align>
+              <wp:posOffset>0</wp:posOffset>
             </wp:positionH>
-            <wp:positionV relativeFrom="paragraph">
-              <wp:posOffset>-875495</wp:posOffset>
+            <wp:positionV relativeFrom="page">
+              <wp:posOffset>5390866</wp:posOffset>
             </wp:positionV>
             <wp:extent cx="1718310" cy="3747135"/>
             <wp:effectExtent l="0" t="0" r="0" b="5715"/>
@@ -3594,17 +3520,7 @@
           </wp:anchor>
         </w:drawing>
       </w:r>
-      <w:r>
-        <w:t>F</w:t>
-      </w:r>
     </w:p>
-    <w:p/>
-    <w:p/>
-    <w:p/>
-    <w:p/>
-    <w:p/>
-    <w:p/>
-    <w:p/>
     <w:p>
       <w:r>
         <w:rPr>
@@ -3612,13 +3528,13 @@
         </w:rPr>
         <w:lastRenderedPageBreak/>
         <w:drawing>
-          <wp:anchor distT="0" distB="0" distL="114300" distR="114300" simplePos="0" relativeHeight="251675648" behindDoc="1" locked="0" layoutInCell="1" allowOverlap="1" wp14:anchorId="7A66167A" wp14:editId="3979434D">
+          <wp:anchor distT="0" distB="0" distL="114300" distR="114300" simplePos="0" relativeHeight="251675648" behindDoc="1" locked="0" layoutInCell="1" allowOverlap="1" wp14:anchorId="7A66167A" wp14:editId="45D11C63">
             <wp:simplePos x="0" y="0"/>
             <wp:positionH relativeFrom="margin">
-              <wp:align>right</wp:align>
+              <wp:posOffset>4158199</wp:posOffset>
             </wp:positionH>
-            <wp:positionV relativeFrom="paragraph">
-              <wp:posOffset>0</wp:posOffset>
+            <wp:positionV relativeFrom="margin">
+              <wp:align>top</wp:align>
             </wp:positionV>
             <wp:extent cx="1753870" cy="3581400"/>
             <wp:effectExtent l="0" t="0" r="0" b="0"/>
@@ -3687,13 +3603,13 @@
           <w:noProof/>
         </w:rPr>
         <w:drawing>
-          <wp:anchor distT="0" distB="0" distL="114300" distR="114300" simplePos="0" relativeHeight="251674624" behindDoc="1" locked="0" layoutInCell="1" allowOverlap="1" wp14:anchorId="7C17B9E9" wp14:editId="354410CA">
+          <wp:anchor distT="0" distB="0" distL="114300" distR="114300" simplePos="0" relativeHeight="251674624" behindDoc="1" locked="0" layoutInCell="1" allowOverlap="1" wp14:anchorId="7C17B9E9" wp14:editId="4014E4CF">
             <wp:simplePos x="0" y="0"/>
             <wp:positionH relativeFrom="margin">
-              <wp:align>center</wp:align>
+              <wp:posOffset>1912029</wp:posOffset>
             </wp:positionH>
-            <wp:positionV relativeFrom="paragraph">
-              <wp:posOffset>41910</wp:posOffset>
+            <wp:positionV relativeFrom="margin">
+              <wp:align>top</wp:align>
             </wp:positionV>
             <wp:extent cx="1713865" cy="3562350"/>
             <wp:effectExtent l="0" t="0" r="635" b="0"/>
@@ -3757,18 +3673,29 @@
           </wp:anchor>
         </w:drawing>
       </w:r>
+    </w:p>
+    <w:p/>
+    <w:p/>
+    <w:p/>
+    <w:p/>
+    <w:p/>
+    <w:p/>
+    <w:p/>
+    <w:p/>
+    <w:p/>
+    <w:p>
       <w:r>
         <w:rPr>
           <w:noProof/>
         </w:rPr>
         <w:drawing>
-          <wp:anchor distT="0" distB="0" distL="114300" distR="114300" simplePos="0" relativeHeight="251673600" behindDoc="1" locked="0" layoutInCell="1" allowOverlap="1" wp14:anchorId="0F44D3A7" wp14:editId="5E785EF8">
+          <wp:anchor distT="0" distB="0" distL="114300" distR="114300" simplePos="0" relativeHeight="251673600" behindDoc="1" locked="0" layoutInCell="1" allowOverlap="1" wp14:anchorId="0F44D3A7" wp14:editId="67B4BC34">
             <wp:simplePos x="0" y="0"/>
             <wp:positionH relativeFrom="margin">
               <wp:align>left</wp:align>
             </wp:positionH>
-            <wp:positionV relativeFrom="paragraph">
-              <wp:posOffset>0</wp:posOffset>
+            <wp:positionV relativeFrom="margin">
+              <wp:align>top</wp:align>
             </wp:positionV>
             <wp:extent cx="1706245" cy="3581400"/>
             <wp:effectExtent l="0" t="0" r="8255" b="0"/>
@@ -3834,96 +3761,22 @@
       </w:r>
     </w:p>
     <w:p/>
+    <w:p/>
+    <w:p/>
+    <w:p/>
     <w:p>
       <w:r>
         <w:rPr>
           <w:noProof/>
         </w:rPr>
         <w:drawing>
-          <wp:anchor distT="0" distB="0" distL="114300" distR="114300" simplePos="0" relativeHeight="251676672" behindDoc="1" locked="0" layoutInCell="1" allowOverlap="1" wp14:anchorId="4AE03DDD" wp14:editId="17B22519">
+          <wp:anchor distT="0" distB="0" distL="114300" distR="114300" simplePos="0" relativeHeight="251678720" behindDoc="1" locked="0" layoutInCell="1" allowOverlap="1" wp14:anchorId="2845F372" wp14:editId="179A57B7">
             <wp:simplePos x="0" y="0"/>
             <wp:positionH relativeFrom="margin">
-              <wp:posOffset>0</wp:posOffset>
+              <wp:posOffset>2156346</wp:posOffset>
             </wp:positionH>
-            <wp:positionV relativeFrom="paragraph">
-              <wp:posOffset>366395</wp:posOffset>
-            </wp:positionV>
-            <wp:extent cx="1638300" cy="3505200"/>
-            <wp:effectExtent l="0" t="0" r="0" b="0"/>
-            <wp:wrapTight wrapText="bothSides">
-              <wp:wrapPolygon edited="0">
-                <wp:start x="0" y="0"/>
-                <wp:lineTo x="0" y="21483"/>
-                <wp:lineTo x="21349" y="21483"/>
-                <wp:lineTo x="21349" y="0"/>
-                <wp:lineTo x="0" y="0"/>
-              </wp:wrapPolygon>
-            </wp:wrapTight>
-            <wp:docPr id="674630744" name="Picture 19"/>
-            <wp:cNvGraphicFramePr>
-              <a:graphicFrameLocks xmlns:a="http://schemas.openxmlformats.org/drawingml/2006/main" noChangeAspect="1"/>
-            </wp:cNvGraphicFramePr>
-            <a:graphic xmlns:a="http://schemas.openxmlformats.org/drawingml/2006/main">
-              <a:graphicData uri="http://schemas.openxmlformats.org/drawingml/2006/picture">
-                <pic:pic xmlns:pic="http://schemas.openxmlformats.org/drawingml/2006/picture">
-                  <pic:nvPicPr>
-                    <pic:cNvPr id="0" name="Picture 19"/>
-                    <pic:cNvPicPr>
-                      <a:picLocks noChangeAspect="1" noChangeArrowheads="1"/>
-                    </pic:cNvPicPr>
-                  </pic:nvPicPr>
-                  <pic:blipFill>
-                    <a:blip r:embed="rId19">
-                      <a:extLst>
-                        <a:ext uri="{28A0092B-C50C-407E-A947-70E740481C1C}">
-                          <a14:useLocalDpi xmlns:a14="http://schemas.microsoft.com/office/drawing/2010/main" val="0"/>
-                        </a:ext>
-                      </a:extLst>
-                    </a:blip>
-                    <a:srcRect/>
-                    <a:stretch>
-                      <a:fillRect/>
-                    </a:stretch>
-                  </pic:blipFill>
-                  <pic:spPr bwMode="auto">
-                    <a:xfrm>
-                      <a:off x="0" y="0"/>
-                      <a:ext cx="1638300" cy="3505200"/>
-                    </a:xfrm>
-                    <a:prstGeom prst="rect">
-                      <a:avLst/>
-                    </a:prstGeom>
-                    <a:noFill/>
-                    <a:ln>
-                      <a:noFill/>
-                    </a:ln>
-                  </pic:spPr>
-                </pic:pic>
-              </a:graphicData>
-            </a:graphic>
-            <wp14:sizeRelH relativeFrom="margin">
-              <wp14:pctWidth>0</wp14:pctWidth>
-            </wp14:sizeRelH>
-            <wp14:sizeRelV relativeFrom="margin">
-              <wp14:pctHeight>0</wp14:pctHeight>
-            </wp14:sizeRelV>
-          </wp:anchor>
-        </w:drawing>
-      </w:r>
-    </w:p>
-    <w:p>
-      <w:r>
-        <w:rPr>
-          <w:noProof/>
-        </w:rPr>
-        <w:drawing>
-          <wp:anchor distT="0" distB="0" distL="114300" distR="114300" simplePos="0" relativeHeight="251678720" behindDoc="1" locked="0" layoutInCell="1" allowOverlap="1" wp14:anchorId="2845F372" wp14:editId="1E991B35">
-            <wp:simplePos x="0" y="0"/>
-            <wp:positionH relativeFrom="margin">
-              <wp:posOffset>2171700</wp:posOffset>
-            </wp:positionH>
-            <wp:positionV relativeFrom="paragraph">
-              <wp:posOffset>11430</wp:posOffset>
+            <wp:positionV relativeFrom="page">
+              <wp:posOffset>5595582</wp:posOffset>
             </wp:positionV>
             <wp:extent cx="1619250" cy="3538855"/>
             <wp:effectExtent l="0" t="0" r="0" b="4445"/>
@@ -3950,7 +3803,7 @@
                     </pic:cNvPicPr>
                   </pic:nvPicPr>
                   <pic:blipFill>
-                    <a:blip r:embed="rId20">
+                    <a:blip r:embed="rId19">
                       <a:extLst>
                         <a:ext uri="{28A0092B-C50C-407E-A947-70E740481C1C}">
                           <a14:useLocalDpi xmlns:a14="http://schemas.microsoft.com/office/drawing/2010/main" val="0"/>
@@ -3992,13 +3845,88 @@
           <w:noProof/>
         </w:rPr>
         <w:drawing>
-          <wp:anchor distT="0" distB="0" distL="114300" distR="114300" simplePos="0" relativeHeight="251677696" behindDoc="1" locked="0" layoutInCell="1" allowOverlap="1" wp14:anchorId="72B57BF8" wp14:editId="3761D061">
+          <wp:anchor distT="0" distB="0" distL="114300" distR="114300" simplePos="0" relativeHeight="251676672" behindDoc="1" locked="0" layoutInCell="1" allowOverlap="1" wp14:anchorId="4AE03DDD" wp14:editId="25F0FB9C">
             <wp:simplePos x="0" y="0"/>
             <wp:positionH relativeFrom="margin">
-              <wp:align>right</wp:align>
+              <wp:posOffset>0</wp:posOffset>
             </wp:positionH>
-            <wp:positionV relativeFrom="paragraph">
-              <wp:posOffset>11430</wp:posOffset>
+            <wp:positionV relativeFrom="page">
+              <wp:posOffset>5636525</wp:posOffset>
+            </wp:positionV>
+            <wp:extent cx="1638300" cy="3505200"/>
+            <wp:effectExtent l="0" t="0" r="0" b="0"/>
+            <wp:wrapTight wrapText="bothSides">
+              <wp:wrapPolygon edited="0">
+                <wp:start x="0" y="0"/>
+                <wp:lineTo x="0" y="21483"/>
+                <wp:lineTo x="21349" y="21483"/>
+                <wp:lineTo x="21349" y="0"/>
+                <wp:lineTo x="0" y="0"/>
+              </wp:wrapPolygon>
+            </wp:wrapTight>
+            <wp:docPr id="674630744" name="Picture 19"/>
+            <wp:cNvGraphicFramePr>
+              <a:graphicFrameLocks xmlns:a="http://schemas.openxmlformats.org/drawingml/2006/main" noChangeAspect="1"/>
+            </wp:cNvGraphicFramePr>
+            <a:graphic xmlns:a="http://schemas.openxmlformats.org/drawingml/2006/main">
+              <a:graphicData uri="http://schemas.openxmlformats.org/drawingml/2006/picture">
+                <pic:pic xmlns:pic="http://schemas.openxmlformats.org/drawingml/2006/picture">
+                  <pic:nvPicPr>
+                    <pic:cNvPr id="0" name="Picture 19"/>
+                    <pic:cNvPicPr>
+                      <a:picLocks noChangeAspect="1" noChangeArrowheads="1"/>
+                    </pic:cNvPicPr>
+                  </pic:nvPicPr>
+                  <pic:blipFill>
+                    <a:blip r:embed="rId20">
+                      <a:extLst>
+                        <a:ext uri="{28A0092B-C50C-407E-A947-70E740481C1C}">
+                          <a14:useLocalDpi xmlns:a14="http://schemas.microsoft.com/office/drawing/2010/main" val="0"/>
+                        </a:ext>
+                      </a:extLst>
+                    </a:blip>
+                    <a:srcRect/>
+                    <a:stretch>
+                      <a:fillRect/>
+                    </a:stretch>
+                  </pic:blipFill>
+                  <pic:spPr bwMode="auto">
+                    <a:xfrm>
+                      <a:off x="0" y="0"/>
+                      <a:ext cx="1638300" cy="3505200"/>
+                    </a:xfrm>
+                    <a:prstGeom prst="rect">
+                      <a:avLst/>
+                    </a:prstGeom>
+                    <a:noFill/>
+                    <a:ln>
+                      <a:noFill/>
+                    </a:ln>
+                  </pic:spPr>
+                </pic:pic>
+              </a:graphicData>
+            </a:graphic>
+            <wp14:sizeRelH relativeFrom="margin">
+              <wp14:pctWidth>0</wp14:pctWidth>
+            </wp14:sizeRelH>
+            <wp14:sizeRelV relativeFrom="margin">
+              <wp14:pctHeight>0</wp14:pctHeight>
+            </wp14:sizeRelV>
+          </wp:anchor>
+        </w:drawing>
+      </w:r>
+      <w:r>
+        <w:rPr>
+          <w:noProof/>
+        </w:rPr>
+        <w:drawing>
+          <wp:anchor distT="0" distB="0" distL="114300" distR="114300" simplePos="0" relativeHeight="251677696" behindDoc="1" locked="0" layoutInCell="1" allowOverlap="1" wp14:anchorId="72B57BF8" wp14:editId="71FC2593">
+            <wp:simplePos x="0" y="0"/>
+            <wp:positionH relativeFrom="margin">
+              <wp:posOffset>4326340</wp:posOffset>
+            </wp:positionH>
+            <wp:positionV relativeFrom="page">
+              <wp:posOffset>5595582</wp:posOffset>
             </wp:positionV>
             <wp:extent cx="1639570" cy="3543300"/>
             <wp:effectExtent l="0" t="0" r="0" b="0"/>
@@ -4072,7 +4000,6 @@
     <w:p/>
     <w:p/>
     <w:p/>
-    <w:p/>
     <w:p>
       <w:r>
         <w:rPr>
@@ -4080,13 +4007,13 @@
         </w:rPr>
         <w:lastRenderedPageBreak/>
         <w:drawing>
-          <wp:anchor distT="0" distB="0" distL="114300" distR="114300" simplePos="0" relativeHeight="251680768" behindDoc="1" locked="0" layoutInCell="1" allowOverlap="1" wp14:anchorId="0E292242" wp14:editId="5B13E5C3">
+          <wp:anchor distT="0" distB="0" distL="114300" distR="114300" simplePos="0" relativeHeight="251680768" behindDoc="1" locked="0" layoutInCell="1" allowOverlap="1" wp14:anchorId="0E292242" wp14:editId="06624427">
             <wp:simplePos x="0" y="0"/>
             <wp:positionH relativeFrom="margin">
               <wp:align>left</wp:align>
             </wp:positionH>
             <wp:positionV relativeFrom="paragraph">
-              <wp:posOffset>19050</wp:posOffset>
+              <wp:posOffset>20396</wp:posOffset>
             </wp:positionV>
             <wp:extent cx="1643380" cy="3448050"/>
             <wp:effectExtent l="0" t="0" r="0" b="0"/>
@@ -4155,13 +4082,88 @@
           <w:noProof/>
         </w:rPr>
         <w:drawing>
-          <wp:anchor distT="0" distB="0" distL="114300" distR="114300" simplePos="0" relativeHeight="251683840" behindDoc="1" locked="0" layoutInCell="1" allowOverlap="1" wp14:anchorId="256254FD" wp14:editId="48633E02">
+          <wp:anchor distT="0" distB="0" distL="114300" distR="114300" simplePos="0" relativeHeight="251681792" behindDoc="1" locked="0" layoutInCell="1" allowOverlap="1" wp14:anchorId="224EB33D" wp14:editId="3FA2BFE5">
             <wp:simplePos x="0" y="0"/>
             <wp:positionH relativeFrom="margin">
-              <wp:posOffset>4303395</wp:posOffset>
+              <wp:align>center</wp:align>
             </wp:positionH>
             <wp:positionV relativeFrom="paragraph">
-              <wp:posOffset>15240</wp:posOffset>
+              <wp:posOffset>14994</wp:posOffset>
+            </wp:positionV>
+            <wp:extent cx="1715135" cy="3486150"/>
+            <wp:effectExtent l="0" t="0" r="0" b="0"/>
+            <wp:wrapTight wrapText="bothSides">
+              <wp:wrapPolygon edited="0">
+                <wp:start x="0" y="0"/>
+                <wp:lineTo x="0" y="21482"/>
+                <wp:lineTo x="21352" y="21482"/>
+                <wp:lineTo x="21352" y="0"/>
+                <wp:lineTo x="0" y="0"/>
+              </wp:wrapPolygon>
+            </wp:wrapTight>
+            <wp:docPr id="732707262" name="Picture 24"/>
+            <wp:cNvGraphicFramePr>
+              <a:graphicFrameLocks xmlns:a="http://schemas.openxmlformats.org/drawingml/2006/main" noChangeAspect="1"/>
+            </wp:cNvGraphicFramePr>
+            <a:graphic xmlns:a="http://schemas.openxmlformats.org/drawingml/2006/main">
+              <a:graphicData uri="http://schemas.openxmlformats.org/drawingml/2006/picture">
+                <pic:pic xmlns:pic="http://schemas.openxmlformats.org/drawingml/2006/picture">
+                  <pic:nvPicPr>
+                    <pic:cNvPr id="0" name="Picture 24"/>
+                    <pic:cNvPicPr>
+                      <a:picLocks noChangeAspect="1" noChangeArrowheads="1"/>
+                    </pic:cNvPicPr>
+                  </pic:nvPicPr>
+                  <pic:blipFill>
+                    <a:blip r:embed="rId23">
+                      <a:extLst>
+                        <a:ext uri="{28A0092B-C50C-407E-A947-70E740481C1C}">
+                          <a14:useLocalDpi xmlns:a14="http://schemas.microsoft.com/office/drawing/2010/main" val="0"/>
+                        </a:ext>
+                      </a:extLst>
+                    </a:blip>
+                    <a:srcRect/>
+                    <a:stretch>
+                      <a:fillRect/>
+                    </a:stretch>
+                  </pic:blipFill>
+                  <pic:spPr bwMode="auto">
+                    <a:xfrm>
+                      <a:off x="0" y="0"/>
+                      <a:ext cx="1715135" cy="3486150"/>
+                    </a:xfrm>
+                    <a:prstGeom prst="rect">
+                      <a:avLst/>
+                    </a:prstGeom>
+                    <a:noFill/>
+                    <a:ln>
+                      <a:noFill/>
+                    </a:ln>
+                  </pic:spPr>
+                </pic:pic>
+              </a:graphicData>
+            </a:graphic>
+            <wp14:sizeRelH relativeFrom="margin">
+              <wp14:pctWidth>0</wp14:pctWidth>
+            </wp14:sizeRelH>
+            <wp14:sizeRelV relativeFrom="margin">
+              <wp14:pctHeight>0</wp14:pctHeight>
+            </wp14:sizeRelV>
+          </wp:anchor>
+        </w:drawing>
+      </w:r>
+      <w:r>
+        <w:rPr>
+          <w:noProof/>
+        </w:rPr>
+        <w:drawing>
+          <wp:anchor distT="0" distB="0" distL="114300" distR="114300" simplePos="0" relativeHeight="251683840" behindDoc="1" locked="0" layoutInCell="1" allowOverlap="1" wp14:anchorId="256254FD" wp14:editId="52DA0574">
+            <wp:simplePos x="0" y="0"/>
+            <wp:positionH relativeFrom="margin">
+              <wp:align>right</wp:align>
+            </wp:positionH>
+            <wp:positionV relativeFrom="paragraph">
+              <wp:posOffset>16586</wp:posOffset>
             </wp:positionV>
             <wp:extent cx="1670685" cy="3470275"/>
             <wp:effectExtent l="0" t="0" r="5715" b="0"/>
@@ -4188,7 +4190,7 @@
                     </pic:cNvPicPr>
                   </pic:nvPicPr>
                   <pic:blipFill>
-                    <a:blip r:embed="rId23">
+                    <a:blip r:embed="rId24">
                       <a:extLst>
                         <a:ext uri="{28A0092B-C50C-407E-A947-70E740481C1C}">
                           <a14:useLocalDpi xmlns:a14="http://schemas.microsoft.com/office/drawing/2010/main" val="0"/>
@@ -4204,81 +4206,6 @@
                     <a:xfrm>
                       <a:off x="0" y="0"/>
                       <a:ext cx="1670685" cy="3470275"/>
-                    </a:xfrm>
-                    <a:prstGeom prst="rect">
-                      <a:avLst/>
-                    </a:prstGeom>
-                    <a:noFill/>
-                    <a:ln>
-                      <a:noFill/>
-                    </a:ln>
-                  </pic:spPr>
-                </pic:pic>
-              </a:graphicData>
-            </a:graphic>
-            <wp14:sizeRelH relativeFrom="margin">
-              <wp14:pctWidth>0</wp14:pctWidth>
-            </wp14:sizeRelH>
-            <wp14:sizeRelV relativeFrom="margin">
-              <wp14:pctHeight>0</wp14:pctHeight>
-            </wp14:sizeRelV>
-          </wp:anchor>
-        </w:drawing>
-      </w:r>
-      <w:r>
-        <w:rPr>
-          <w:noProof/>
-        </w:rPr>
-        <w:drawing>
-          <wp:anchor distT="0" distB="0" distL="114300" distR="114300" simplePos="0" relativeHeight="251681792" behindDoc="1" locked="0" layoutInCell="1" allowOverlap="1" wp14:anchorId="224EB33D" wp14:editId="403EDCD7">
-            <wp:simplePos x="0" y="0"/>
-            <wp:positionH relativeFrom="margin">
-              <wp:align>center</wp:align>
-            </wp:positionH>
-            <wp:positionV relativeFrom="paragraph">
-              <wp:posOffset>0</wp:posOffset>
-            </wp:positionV>
-            <wp:extent cx="1715135" cy="3486150"/>
-            <wp:effectExtent l="0" t="0" r="0" b="0"/>
-            <wp:wrapTight wrapText="bothSides">
-              <wp:wrapPolygon edited="0">
-                <wp:start x="0" y="0"/>
-                <wp:lineTo x="0" y="21482"/>
-                <wp:lineTo x="21352" y="21482"/>
-                <wp:lineTo x="21352" y="0"/>
-                <wp:lineTo x="0" y="0"/>
-              </wp:wrapPolygon>
-            </wp:wrapTight>
-            <wp:docPr id="732707262" name="Picture 24"/>
-            <wp:cNvGraphicFramePr>
-              <a:graphicFrameLocks xmlns:a="http://schemas.openxmlformats.org/drawingml/2006/main" noChangeAspect="1"/>
-            </wp:cNvGraphicFramePr>
-            <a:graphic xmlns:a="http://schemas.openxmlformats.org/drawingml/2006/main">
-              <a:graphicData uri="http://schemas.openxmlformats.org/drawingml/2006/picture">
-                <pic:pic xmlns:pic="http://schemas.openxmlformats.org/drawingml/2006/picture">
-                  <pic:nvPicPr>
-                    <pic:cNvPr id="0" name="Picture 24"/>
-                    <pic:cNvPicPr>
-                      <a:picLocks noChangeAspect="1" noChangeArrowheads="1"/>
-                    </pic:cNvPicPr>
-                  </pic:nvPicPr>
-                  <pic:blipFill>
-                    <a:blip r:embed="rId24">
-                      <a:extLst>
-                        <a:ext uri="{28A0092B-C50C-407E-A947-70E740481C1C}">
-                          <a14:useLocalDpi xmlns:a14="http://schemas.microsoft.com/office/drawing/2010/main" val="0"/>
-                        </a:ext>
-                      </a:extLst>
-                    </a:blip>
-                    <a:srcRect/>
-                    <a:stretch>
-                      <a:fillRect/>
-                    </a:stretch>
-                  </pic:blipFill>
-                  <pic:spPr bwMode="auto">
-                    <a:xfrm>
-                      <a:off x="0" y="0"/>
-                      <a:ext cx="1715135" cy="3486150"/>
                     </a:xfrm>
                     <a:prstGeom prst="rect">
                       <a:avLst/>
@@ -4319,13 +4246,13 @@
           <w:noProof/>
         </w:rPr>
         <w:drawing>
-          <wp:anchor distT="0" distB="0" distL="114300" distR="114300" simplePos="0" relativeHeight="251684864" behindDoc="1" locked="0" layoutInCell="1" allowOverlap="1" wp14:anchorId="46AAE7FE" wp14:editId="578FEB12">
+          <wp:anchor distT="0" distB="0" distL="114300" distR="114300" simplePos="0" relativeHeight="251684864" behindDoc="1" locked="0" layoutInCell="1" allowOverlap="1" wp14:anchorId="46AAE7FE" wp14:editId="3EA64CCB">
             <wp:simplePos x="0" y="0"/>
             <wp:positionH relativeFrom="margin">
-              <wp:align>center</wp:align>
+              <wp:posOffset>2234762</wp:posOffset>
             </wp:positionH>
             <wp:positionV relativeFrom="paragraph">
-              <wp:posOffset>84455</wp:posOffset>
+              <wp:posOffset>2671</wp:posOffset>
             </wp:positionV>
             <wp:extent cx="1705970" cy="3560708"/>
             <wp:effectExtent l="0" t="0" r="8890" b="1905"/>
@@ -4394,13 +4321,13 @@
           <w:noProof/>
         </w:rPr>
         <w:drawing>
-          <wp:anchor distT="0" distB="0" distL="114300" distR="114300" simplePos="0" relativeHeight="251682816" behindDoc="1" locked="0" layoutInCell="1" allowOverlap="1" wp14:anchorId="0A8867EC" wp14:editId="2E0775EB">
+          <wp:anchor distT="0" distB="0" distL="114300" distR="114300" simplePos="0" relativeHeight="251682816" behindDoc="1" locked="0" layoutInCell="1" allowOverlap="1" wp14:anchorId="0A8867EC" wp14:editId="2728E331">
             <wp:simplePos x="0" y="0"/>
             <wp:positionH relativeFrom="margin">
-              <wp:align>left</wp:align>
+              <wp:posOffset>247650</wp:posOffset>
             </wp:positionH>
             <wp:positionV relativeFrom="paragraph">
-              <wp:posOffset>54850</wp:posOffset>
+              <wp:posOffset>6985</wp:posOffset>
             </wp:positionV>
             <wp:extent cx="1623695" cy="3499485"/>
             <wp:effectExtent l="0" t="0" r="0" b="5715"/>
@@ -4465,19 +4392,6 @@
         </w:drawing>
       </w:r>
     </w:p>
-    <w:p/>
-    <w:p/>
-    <w:p/>
-    <w:p/>
-    <w:p/>
-    <w:p/>
-    <w:p/>
-    <w:p/>
-    <w:p/>
-    <w:p/>
-    <w:p/>
-    <w:p/>
-    <w:p/>
     <w:p/>
     <w:p/>
     <w:p/>

</xml_diff>